<commit_message>
Add portfolio link to resume header
Co-Authored-By: Claude Fable 5 <noreply@anthropic.com>
</commit_message>
<xml_diff>
--- a/public/Abdullatif_Alzaid_CV.docx
+++ b/public/Abdullatif_Alzaid_CV.docx
@@ -30,6 +30,20 @@
           <w:szCs w:val="20"/>
         </w:rPr>
         <w:t xml:space="preserve">Software Engineering Student  |  Kuwait  |  +965 9679 6655  |  abdullatifalzaid206@gmail.com</w:t>
+      </w:r>
+    </w:p>
+    <w:p>
+      <w:pPr>
+        <w:spacing w:after="200"/>
+      </w:pPr>
+      <w:r>
+        <w:rPr>
+          <w:rFonts w:ascii="Calibri" w:cs="Calibri" w:eastAsia="Calibri" w:hAnsi="Calibri"/>
+          <w:color w:val="444444"/>
+          <w:sz w:val="20"/>
+          <w:szCs w:val="20"/>
+        </w:rPr>
+        <w:t xml:space="preserve">Portfolio: https://abdullatif-portfolio.vercel.app</w:t>
       </w:r>
     </w:p>
     <w:p>

</xml_diff>

<commit_message>
Fix resume wording that implied completed client transactions
No commercial deal has actually closed yet (pending business license)
- correct the summary and project bullets to describe the sites as
  self-initiated outreach pieces, not delivered freelance work.

Co-Authored-By: Claude Fable 5 <noreply@anthropic.com>
</commit_message>
<xml_diff>
--- a/public/Abdullatif_Alzaid_CV.docx
+++ b/public/Abdullatif_Alzaid_CV.docx
@@ -76,7 +76,7 @@
           <w:sz w:val="21"/>
           <w:szCs w:val="21"/>
         </w:rPr>
-        <w:t xml:space="preserve">Software Engineering student at Abdulla Al-Salem University (AASU) who designs, directs, and ships real production web products using AI-assisted development workflows — orchestrating AI coding tools to translate business requirements into deployed software, while personally owning UI/UX design decisions, quality testing, deployment operations, and client management. Delivered multiple live client products end-to-end through independent freelance work. Strong interest in applying AI to practical software engineering and business problems.</w:t>
+        <w:t xml:space="preserve">Software Engineering student at Abdulla Al-Salem University (AASU) who designs, directs, and ships real production web products using AI-assisted development workflows — orchestrating AI coding tools to translate business requirements into deployed software, while personally owning UI/UX design decisions, quality testing, and deployment operations. Built and deployed several live, production-ready websites as outreach pieces to pitch directly to small-business owners. Strong interest in applying AI to practical software engineering and business problems.</w:t>
       </w:r>
     </w:p>
     <w:p>
@@ -234,7 +234,7 @@
           <w:sz w:val="22"/>
           <w:szCs w:val="22"/>
         </w:rPr>
-        <w:t xml:space="preserve">Client Web Platforms (Independent Freelance Work)</w:t>
+        <w:t xml:space="preserve">Client Outreach Web Platforms (Self-Initiated)</w:t>
       </w:r>
       <w:r>
         <w:rPr>
@@ -307,7 +307,7 @@
           <w:sz w:val="21"/>
           <w:szCs w:val="21"/>
         </w:rPr>
-        <w:t xml:space="preserve">Managed the full client relationship independently: outreach, pricing negotiation, scope definition, and delivery.</w:t>
+        <w:t xml:space="preserve">Used the deployed sites to reach out directly to business owners, pitching the finished product as a concrete example of the service (no commercial transaction completed to date, pending business licensing).</w:t>
       </w:r>
     </w:p>
     <w:p>

</xml_diff>